<commit_message>
Work report for together and myself
</commit_message>
<xml_diff>
--- a/porocila/skupno_porocilo.docx
+++ b/porocila/skupno_porocilo.docx
@@ -4,7 +4,7 @@
   <w:body>
     <w:p>
       <w:pPr>
-        <w:pStyle w:val="Naslov"/>
+        <w:pStyle w:val="Title"/>
         <w:jc w:val="center"/>
       </w:pPr>
       <w:r>
@@ -68,13 +68,13 @@
     <w:p/>
     <w:p>
       <w:pPr>
-        <w:pStyle w:val="Naslov"/>
+        <w:pStyle w:val="Title"/>
         <w:jc w:val="center"/>
       </w:pPr>
     </w:p>
     <w:p>
       <w:pPr>
-        <w:pStyle w:val="Naslov"/>
+        <w:pStyle w:val="Title"/>
         <w:jc w:val="center"/>
         <w:rPr>
           <w:b/>
@@ -91,7 +91,7 @@
     </w:p>
     <w:p>
       <w:pPr>
-        <w:pStyle w:val="Naslov"/>
+        <w:pStyle w:val="Title"/>
         <w:jc w:val="center"/>
         <w:rPr>
           <w:rFonts w:asciiTheme="minorHAnsi" w:hAnsiTheme="minorHAnsi" w:cstheme="minorHAnsi"/>
@@ -223,7 +223,7 @@
       <w:sdtContent>
         <w:p>
           <w:pPr>
-            <w:pStyle w:val="Kazalovsebine1"/>
+            <w:pStyle w:val="TOC1"/>
             <w:rPr>
               <w:b/>
               <w:bCs/>
@@ -239,13 +239,13 @@
         </w:p>
         <w:p>
           <w:pPr>
-            <w:pStyle w:val="Kazalovsebine1"/>
+            <w:pStyle w:val="TOC1"/>
             <w:rPr>
               <w:rFonts w:eastAsiaTheme="minorEastAsia"/>
               <w:noProof/>
               <w:sz w:val="24"/>
               <w:szCs w:val="24"/>
-              <w:lang w:val="en-SI" w:eastAsia="en-SI"/>
+              <w:lang/>
             </w:rPr>
           </w:pPr>
           <w:r>
@@ -260,7 +260,7 @@
           <w:hyperlink w:anchor="_Toc243910005" w:history="1">
             <w:r>
               <w:rPr>
-                <w:rStyle w:val="Hiperpovezava"/>
+                <w:rStyle w:val="Hyperlink"/>
                 <w:noProof/>
               </w:rPr>
               <w:t>1</w:t>
@@ -271,13 +271,13 @@
                 <w:noProof/>
                 <w:sz w:val="24"/>
                 <w:szCs w:val="24"/>
-                <w:lang w:val="en-SI" w:eastAsia="en-SI"/>
+                <w:lang/>
               </w:rPr>
               <w:tab/>
             </w:r>
             <w:r>
               <w:rPr>
-                <w:rStyle w:val="Hiperpovezava"/>
+                <w:rStyle w:val="Hyperlink"/>
                 <w:noProof/>
               </w:rPr>
               <w:t>Osnovni podatki in povezave</w:t>
@@ -334,19 +334,19 @@
         </w:p>
         <w:p>
           <w:pPr>
-            <w:pStyle w:val="Kazalovsebine1"/>
+            <w:pStyle w:val="TOC1"/>
             <w:rPr>
               <w:rFonts w:eastAsiaTheme="minorEastAsia"/>
               <w:noProof/>
               <w:sz w:val="24"/>
               <w:szCs w:val="24"/>
-              <w:lang w:val="en-SI" w:eastAsia="en-SI"/>
+              <w:lang/>
             </w:rPr>
           </w:pPr>
           <w:hyperlink w:anchor="_Toc243910006" w:history="1">
             <w:r>
               <w:rPr>
-                <w:rStyle w:val="Hiperpovezava"/>
+                <w:rStyle w:val="Hyperlink"/>
                 <w:noProof/>
               </w:rPr>
               <w:t>2</w:t>
@@ -357,13 +357,13 @@
                 <w:noProof/>
                 <w:sz w:val="24"/>
                 <w:szCs w:val="24"/>
-                <w:lang w:val="en-SI" w:eastAsia="en-SI"/>
+                <w:lang/>
               </w:rPr>
               <w:tab/>
             </w:r>
             <w:r>
               <w:rPr>
-                <w:rStyle w:val="Hiperpovezava"/>
+                <w:rStyle w:val="Hyperlink"/>
                 <w:noProof/>
               </w:rPr>
               <w:t>Poročilo za prvi teden</w:t>
@@ -437,8 +437,8 @@
         </w:p>
       </w:sdtContent>
     </w:sdt>
-    <w:bookmarkStart w:id="0" w:name="_Toc243910005" w:displacedByCustomXml="prev"/>
-    <w:bookmarkStart w:id="1" w:name="_Toc243254479" w:displacedByCustomXml="prev"/>
+    <w:bookmarkStart w:id="0" w:name="_Toc243254479" w:displacedByCustomXml="prev"/>
+    <w:bookmarkStart w:id="1" w:name="_Toc243910005" w:displacedByCustomXml="prev"/>
     <w:p>
       <w:pPr>
         <w:rPr>
@@ -454,7 +454,7 @@
     </w:p>
     <w:p>
       <w:pPr>
-        <w:pStyle w:val="Naslov1"/>
+        <w:pStyle w:val="Heading1"/>
       </w:pPr>
       <w:proofErr w:type="spellStart"/>
       <w:r>
@@ -1000,15 +1000,7 @@
       </w:r>
       <w:proofErr w:type="spellEnd"/>
       <w:r>
-        <w:t xml:space="preserve"> </w:t>
-      </w:r>
-      <w:proofErr w:type="spellStart"/>
-      <w:r>
-        <w:t>na</w:t>
-      </w:r>
-      <w:proofErr w:type="spellEnd"/>
-      <w:r>
-        <w:t xml:space="preserve"> </w:t>
+        <w:t xml:space="preserve"> na </w:t>
       </w:r>
       <w:proofErr w:type="spellStart"/>
       <w:r>
@@ -1278,13 +1270,8 @@
     </w:p>
     <w:p/>
     <w:p>
-      <w:proofErr w:type="spellStart"/>
-      <w:r>
-        <w:t>Povezava</w:t>
-      </w:r>
-      <w:proofErr w:type="spellEnd"/>
-      <w:r>
-        <w:t xml:space="preserve"> do </w:t>
+      <w:r>
+        <w:t xml:space="preserve">Povezava do </w:t>
       </w:r>
       <w:proofErr w:type="spellStart"/>
       <w:r>
@@ -1314,7 +1301,7 @@
     <w:p/>
     <w:p>
       <w:pPr>
-        <w:pStyle w:val="Naslov1"/>
+        <w:pStyle w:val="Heading1"/>
       </w:pPr>
       <w:bookmarkStart w:id="2" w:name="_Toc243249358"/>
       <w:bookmarkStart w:id="3" w:name="_Toc243254480"/>
@@ -1507,15 +1494,7 @@
       </w:r>
       <w:proofErr w:type="spellEnd"/>
       <w:r>
-        <w:t xml:space="preserve"> </w:t>
-      </w:r>
-      <w:proofErr w:type="spellStart"/>
-      <w:r>
-        <w:t>ter</w:t>
-      </w:r>
-      <w:proofErr w:type="spellEnd"/>
-      <w:r>
-        <w:t xml:space="preserve"> </w:t>
+        <w:t xml:space="preserve"> ter </w:t>
       </w:r>
       <w:proofErr w:type="spellStart"/>
       <w:r>
@@ -1629,7 +1608,7 @@
     </w:p>
     <w:p>
       <w:pPr>
-        <w:pStyle w:val="Odstavekseznama"/>
+        <w:pStyle w:val="ListParagraph"/>
         <w:numPr>
           <w:ilvl w:val="0"/>
           <w:numId w:val="2"/>
@@ -1658,7 +1637,7 @@
     </w:p>
     <w:p>
       <w:pPr>
-        <w:pStyle w:val="Odstavekseznama"/>
+        <w:pStyle w:val="ListParagraph"/>
         <w:numPr>
           <w:ilvl w:val="0"/>
           <w:numId w:val="2"/>
@@ -1696,7 +1675,7 @@
     </w:p>
     <w:p>
       <w:pPr>
-        <w:pStyle w:val="Odstavekseznama"/>
+        <w:pStyle w:val="ListParagraph"/>
         <w:numPr>
           <w:ilvl w:val="0"/>
           <w:numId w:val="2"/>
@@ -1733,7 +1712,7 @@
     </w:p>
     <w:p>
       <w:pPr>
-        <w:pStyle w:val="Odstavekseznama"/>
+        <w:pStyle w:val="ListParagraph"/>
         <w:numPr>
           <w:ilvl w:val="0"/>
           <w:numId w:val="2"/>
@@ -1762,7 +1741,7 @@
     </w:p>
     <w:p>
       <w:pPr>
-        <w:pStyle w:val="Odstavekseznama"/>
+        <w:pStyle w:val="ListParagraph"/>
         <w:numPr>
           <w:ilvl w:val="0"/>
           <w:numId w:val="2"/>
@@ -1827,6 +1806,1018 @@
       <w:proofErr w:type="spellStart"/>
       <w:r>
         <w:t>generirali</w:t>
+      </w:r>
+      <w:proofErr w:type="spellEnd"/>
+    </w:p>
+    <w:p>
+      <w:pPr>
+        <w:pStyle w:val="Heading1"/>
+      </w:pPr>
+      <w:proofErr w:type="spellStart"/>
+      <w:r>
+        <w:t>Poročilo</w:t>
+      </w:r>
+      <w:proofErr w:type="spellEnd"/>
+      <w:r>
+        <w:t xml:space="preserve"> za</w:t>
+      </w:r>
+      <w:r>
+        <w:t xml:space="preserve"> </w:t>
+      </w:r>
+      <w:proofErr w:type="spellStart"/>
+      <w:r>
+        <w:t>drugi</w:t>
+      </w:r>
+      <w:proofErr w:type="spellEnd"/>
+      <w:r>
+        <w:t xml:space="preserve"> </w:t>
+      </w:r>
+      <w:proofErr w:type="spellStart"/>
+      <w:r>
+        <w:t>teden</w:t>
+      </w:r>
+      <w:proofErr w:type="spellEnd"/>
+    </w:p>
+    <w:p>
+      <w:r>
+        <w:t xml:space="preserve">Drugi </w:t>
+      </w:r>
+      <w:proofErr w:type="spellStart"/>
+      <w:r>
+        <w:t>teden</w:t>
+      </w:r>
+      <w:proofErr w:type="spellEnd"/>
+      <w:r>
+        <w:t xml:space="preserve"> </w:t>
+      </w:r>
+      <w:proofErr w:type="spellStart"/>
+      <w:r>
+        <w:t>smo</w:t>
+      </w:r>
+      <w:proofErr w:type="spellEnd"/>
+      <w:r>
+        <w:t xml:space="preserve"> </w:t>
+      </w:r>
+      <w:proofErr w:type="spellStart"/>
+      <w:r>
+        <w:t>začeli</w:t>
+      </w:r>
+      <w:proofErr w:type="spellEnd"/>
+      <w:r>
+        <w:t xml:space="preserve"> </w:t>
+      </w:r>
+      <w:proofErr w:type="spellStart"/>
+      <w:r>
+        <w:t>razvijati</w:t>
+      </w:r>
+      <w:proofErr w:type="spellEnd"/>
+      <w:r>
+        <w:t xml:space="preserve"> </w:t>
+      </w:r>
+      <w:proofErr w:type="spellStart"/>
+      <w:r>
+        <w:t>aplikacijo</w:t>
+      </w:r>
+      <w:proofErr w:type="spellEnd"/>
+      <w:r>
+        <w:t xml:space="preserve"> v </w:t>
+      </w:r>
+      <w:proofErr w:type="spellStart"/>
+      <w:r>
+        <w:t>zaledju</w:t>
+      </w:r>
+      <w:proofErr w:type="spellEnd"/>
+      <w:r>
+        <w:t xml:space="preserve"> v Express in </w:t>
+      </w:r>
+      <w:proofErr w:type="spellStart"/>
+      <w:r>
+        <w:t>mobilno</w:t>
+      </w:r>
+      <w:proofErr w:type="spellEnd"/>
+      <w:r>
+        <w:t xml:space="preserve"> android </w:t>
+      </w:r>
+      <w:proofErr w:type="spellStart"/>
+      <w:r>
+        <w:t>aplikacijo</w:t>
+      </w:r>
+      <w:proofErr w:type="spellEnd"/>
+      <w:r>
+        <w:t xml:space="preserve">. Povezava med </w:t>
+      </w:r>
+      <w:proofErr w:type="spellStart"/>
+      <w:r>
+        <w:t>njima</w:t>
+      </w:r>
+      <w:proofErr w:type="spellEnd"/>
+      <w:r>
+        <w:t xml:space="preserve"> </w:t>
+      </w:r>
+      <w:proofErr w:type="spellStart"/>
+      <w:r>
+        <w:t>preko</w:t>
+      </w:r>
+      <w:proofErr w:type="spellEnd"/>
+      <w:r>
+        <w:t xml:space="preserve"> </w:t>
+      </w:r>
+      <w:proofErr w:type="spellStart"/>
+      <w:r>
+        <w:t>vtičnic</w:t>
+      </w:r>
+      <w:proofErr w:type="spellEnd"/>
+      <w:r>
+        <w:t xml:space="preserve"> je </w:t>
+      </w:r>
+      <w:proofErr w:type="spellStart"/>
+      <w:r>
+        <w:t>bila</w:t>
+      </w:r>
+      <w:proofErr w:type="spellEnd"/>
+      <w:r>
+        <w:t xml:space="preserve"> </w:t>
+      </w:r>
+      <w:proofErr w:type="spellStart"/>
+      <w:r>
+        <w:t>debuggirana</w:t>
+      </w:r>
+      <w:proofErr w:type="spellEnd"/>
+      <w:r>
+        <w:t xml:space="preserve"> in s </w:t>
+      </w:r>
+      <w:proofErr w:type="spellStart"/>
+      <w:r>
+        <w:t>tem</w:t>
+      </w:r>
+      <w:proofErr w:type="spellEnd"/>
+      <w:r>
+        <w:t xml:space="preserve"> </w:t>
+      </w:r>
+      <w:proofErr w:type="spellStart"/>
+      <w:r>
+        <w:t>dokončno</w:t>
+      </w:r>
+      <w:proofErr w:type="spellEnd"/>
+      <w:r>
+        <w:t xml:space="preserve"> </w:t>
+      </w:r>
+      <w:proofErr w:type="spellStart"/>
+      <w:r>
+        <w:t>zaključena</w:t>
+      </w:r>
+      <w:proofErr w:type="spellEnd"/>
+      <w:r>
+        <w:t xml:space="preserve">. </w:t>
+      </w:r>
+      <w:r>
+        <w:t xml:space="preserve">Delo </w:t>
+      </w:r>
+      <w:proofErr w:type="spellStart"/>
+      <w:r>
+        <w:t>smo</w:t>
+      </w:r>
+      <w:proofErr w:type="spellEnd"/>
+      <w:r>
+        <w:t xml:space="preserve"> </w:t>
+      </w:r>
+      <w:proofErr w:type="spellStart"/>
+      <w:r>
+        <w:t>si</w:t>
+      </w:r>
+      <w:proofErr w:type="spellEnd"/>
+      <w:r>
+        <w:t xml:space="preserve"> </w:t>
+      </w:r>
+      <w:proofErr w:type="spellStart"/>
+      <w:r>
+        <w:t>razdelili</w:t>
+      </w:r>
+      <w:proofErr w:type="spellEnd"/>
+      <w:r>
+        <w:t xml:space="preserve"> po </w:t>
+      </w:r>
+      <w:proofErr w:type="spellStart"/>
+      <w:r>
+        <w:t>sposobnostih</w:t>
+      </w:r>
+      <w:proofErr w:type="spellEnd"/>
+      <w:r>
+        <w:t xml:space="preserve"> in </w:t>
+      </w:r>
+      <w:proofErr w:type="spellStart"/>
+      <w:r>
+        <w:t>lastnih</w:t>
+      </w:r>
+      <w:proofErr w:type="spellEnd"/>
+      <w:r>
+        <w:t xml:space="preserve"> </w:t>
+      </w:r>
+      <w:proofErr w:type="spellStart"/>
+      <w:r>
+        <w:t>željah</w:t>
+      </w:r>
+      <w:proofErr w:type="spellEnd"/>
+      <w:r>
+        <w:t xml:space="preserve">. </w:t>
+      </w:r>
+      <w:proofErr w:type="spellStart"/>
+      <w:r>
+        <w:t>Izdelali</w:t>
+      </w:r>
+      <w:proofErr w:type="spellEnd"/>
+      <w:r>
+        <w:t xml:space="preserve"> </w:t>
+      </w:r>
+      <w:proofErr w:type="spellStart"/>
+      <w:r>
+        <w:t>smo</w:t>
+      </w:r>
+      <w:proofErr w:type="spellEnd"/>
+      <w:r>
+        <w:t xml:space="preserve"> </w:t>
+      </w:r>
+      <w:proofErr w:type="spellStart"/>
+      <w:r>
+        <w:t>večji</w:t>
+      </w:r>
+      <w:proofErr w:type="spellEnd"/>
+      <w:r>
+        <w:t xml:space="preserve"> del </w:t>
+      </w:r>
+      <w:proofErr w:type="spellStart"/>
+      <w:r>
+        <w:t>zaledja</w:t>
+      </w:r>
+      <w:proofErr w:type="spellEnd"/>
+      <w:r>
+        <w:t xml:space="preserve"> in android </w:t>
+      </w:r>
+      <w:proofErr w:type="spellStart"/>
+      <w:r>
+        <w:t>aplikacije</w:t>
+      </w:r>
+      <w:proofErr w:type="spellEnd"/>
+      <w:r>
+        <w:t xml:space="preserve">, </w:t>
+      </w:r>
+      <w:proofErr w:type="spellStart"/>
+      <w:r>
+        <w:t>manjka</w:t>
+      </w:r>
+      <w:proofErr w:type="spellEnd"/>
+      <w:r>
+        <w:t xml:space="preserve"> </w:t>
+      </w:r>
+      <w:proofErr w:type="spellStart"/>
+      <w:r>
+        <w:t>še</w:t>
+      </w:r>
+      <w:proofErr w:type="spellEnd"/>
+      <w:r>
+        <w:t xml:space="preserve"> </w:t>
+      </w:r>
+      <w:proofErr w:type="spellStart"/>
+      <w:r>
+        <w:t>stran</w:t>
+      </w:r>
+      <w:proofErr w:type="spellEnd"/>
+      <w:r>
+        <w:t xml:space="preserve"> za </w:t>
+      </w:r>
+      <w:proofErr w:type="spellStart"/>
+      <w:r>
+        <w:t>prikazovanje</w:t>
+      </w:r>
+      <w:proofErr w:type="spellEnd"/>
+      <w:r>
+        <w:t xml:space="preserve"> </w:t>
+      </w:r>
+      <w:proofErr w:type="spellStart"/>
+      <w:r>
+        <w:t>vprašanj</w:t>
+      </w:r>
+      <w:proofErr w:type="spellEnd"/>
+      <w:r>
+        <w:t xml:space="preserve">, </w:t>
+      </w:r>
+      <w:proofErr w:type="spellStart"/>
+      <w:r>
+        <w:t>točkovanje</w:t>
+      </w:r>
+      <w:proofErr w:type="spellEnd"/>
+      <w:r>
+        <w:t xml:space="preserve"> </w:t>
+      </w:r>
+      <w:proofErr w:type="spellStart"/>
+      <w:r>
+        <w:t>pravilnih</w:t>
+      </w:r>
+      <w:proofErr w:type="spellEnd"/>
+      <w:r>
+        <w:t xml:space="preserve"> </w:t>
+      </w:r>
+      <w:proofErr w:type="spellStart"/>
+      <w:r>
+        <w:t>odgovorov</w:t>
+      </w:r>
+      <w:proofErr w:type="spellEnd"/>
+      <w:r>
+        <w:t>, manjše podrobn</w:t>
+      </w:r>
+      <w:proofErr w:type="spellStart"/>
+      <w:r>
+        <w:t>osti</w:t>
+      </w:r>
+      <w:proofErr w:type="spellEnd"/>
+      <w:r>
+        <w:t xml:space="preserve"> in </w:t>
+      </w:r>
+      <w:proofErr w:type="spellStart"/>
+      <w:r>
+        <w:t>izboljšave</w:t>
+      </w:r>
+      <w:proofErr w:type="spellEnd"/>
+      <w:r>
+        <w:t xml:space="preserve"> </w:t>
+      </w:r>
+      <w:proofErr w:type="spellStart"/>
+      <w:r>
+        <w:t>na</w:t>
+      </w:r>
+      <w:proofErr w:type="spellEnd"/>
+      <w:r>
+        <w:t xml:space="preserve"> </w:t>
+      </w:r>
+      <w:proofErr w:type="spellStart"/>
+      <w:r>
+        <w:t>ostalih</w:t>
+      </w:r>
+      <w:proofErr w:type="spellEnd"/>
+      <w:r>
+        <w:t xml:space="preserve"> </w:t>
+      </w:r>
+      <w:proofErr w:type="spellStart"/>
+      <w:r>
+        <w:t>straneh</w:t>
+      </w:r>
+      <w:proofErr w:type="spellEnd"/>
+      <w:r>
+        <w:t xml:space="preserve"> ter </w:t>
+      </w:r>
+      <w:proofErr w:type="spellStart"/>
+      <w:r>
+        <w:t>testiranje</w:t>
+      </w:r>
+      <w:proofErr w:type="spellEnd"/>
+      <w:r>
+        <w:t xml:space="preserve"> in </w:t>
+      </w:r>
+      <w:proofErr w:type="spellStart"/>
+      <w:r>
+        <w:t>debuggiranje</w:t>
+      </w:r>
+      <w:proofErr w:type="spellEnd"/>
+      <w:r>
+        <w:t xml:space="preserve">. </w:t>
+      </w:r>
+      <w:proofErr w:type="spellStart"/>
+      <w:r>
+        <w:t>Podroben</w:t>
+      </w:r>
+      <w:proofErr w:type="spellEnd"/>
+      <w:r>
+        <w:t xml:space="preserve"> </w:t>
+      </w:r>
+      <w:proofErr w:type="spellStart"/>
+      <w:r>
+        <w:t>opis</w:t>
+      </w:r>
+      <w:proofErr w:type="spellEnd"/>
+      <w:r>
+        <w:t xml:space="preserve"> </w:t>
+      </w:r>
+      <w:proofErr w:type="spellStart"/>
+      <w:r>
+        <w:t>nalog</w:t>
+      </w:r>
+      <w:proofErr w:type="spellEnd"/>
+      <w:r>
+        <w:t xml:space="preserve">, ki </w:t>
+      </w:r>
+      <w:proofErr w:type="spellStart"/>
+      <w:r>
+        <w:t>smo</w:t>
+      </w:r>
+      <w:proofErr w:type="spellEnd"/>
+      <w:r>
+        <w:t xml:space="preserve"> </w:t>
+      </w:r>
+      <w:proofErr w:type="spellStart"/>
+      <w:r>
+        <w:t>jih</w:t>
+      </w:r>
+      <w:proofErr w:type="spellEnd"/>
+      <w:r>
+        <w:t xml:space="preserve"> </w:t>
+      </w:r>
+      <w:proofErr w:type="spellStart"/>
+      <w:r>
+        <w:t>opravili</w:t>
+      </w:r>
+      <w:proofErr w:type="spellEnd"/>
+      <w:r>
+        <w:t>:</w:t>
+      </w:r>
+    </w:p>
+    <w:p>
+      <w:pPr>
+        <w:pStyle w:val="ListParagraph"/>
+        <w:numPr>
+          <w:ilvl w:val="0"/>
+          <w:numId w:val="9"/>
+        </w:numPr>
+      </w:pPr>
+      <w:proofErr w:type="spellStart"/>
+      <w:r>
+        <w:t>I</w:t>
+      </w:r>
+      <w:r>
+        <w:t>mplementir</w:t>
+      </w:r>
+      <w:r>
+        <w:t>ali</w:t>
+      </w:r>
+      <w:proofErr w:type="spellEnd"/>
+      <w:r>
+        <w:t xml:space="preserve"> </w:t>
+      </w:r>
+      <w:proofErr w:type="spellStart"/>
+      <w:r>
+        <w:t>smo</w:t>
+      </w:r>
+      <w:proofErr w:type="spellEnd"/>
+      <w:r>
+        <w:t xml:space="preserve"> </w:t>
+      </w:r>
+      <w:proofErr w:type="spellStart"/>
+      <w:r>
+        <w:t>baz</w:t>
+      </w:r>
+      <w:r>
+        <w:t>o</w:t>
+      </w:r>
+      <w:proofErr w:type="spellEnd"/>
+      <w:r>
+        <w:t xml:space="preserve"> </w:t>
+      </w:r>
+      <w:proofErr w:type="spellStart"/>
+      <w:r>
+        <w:t>podatkov</w:t>
+      </w:r>
+      <w:proofErr w:type="spellEnd"/>
+      <w:r>
+        <w:t xml:space="preserve"> </w:t>
+      </w:r>
+      <w:r>
+        <w:t xml:space="preserve">in </w:t>
+      </w:r>
+      <w:proofErr w:type="spellStart"/>
+      <w:r>
+        <w:t>izdelali</w:t>
+      </w:r>
+      <w:proofErr w:type="spellEnd"/>
+      <w:r>
+        <w:t xml:space="preserve"> Mongoose </w:t>
+      </w:r>
+      <w:proofErr w:type="spellStart"/>
+      <w:r>
+        <w:t>she</w:t>
+      </w:r>
+      <w:r>
+        <w:t>me</w:t>
+      </w:r>
+      <w:proofErr w:type="spellEnd"/>
+    </w:p>
+    <w:p>
+      <w:pPr>
+        <w:pStyle w:val="ListParagraph"/>
+        <w:numPr>
+          <w:ilvl w:val="0"/>
+          <w:numId w:val="9"/>
+        </w:numPr>
+      </w:pPr>
+      <w:r>
+        <w:t xml:space="preserve">V </w:t>
+      </w:r>
+      <w:proofErr w:type="spellStart"/>
+      <w:r>
+        <w:t>zaledju</w:t>
+      </w:r>
+      <w:proofErr w:type="spellEnd"/>
+      <w:r>
+        <w:t xml:space="preserve"> </w:t>
+      </w:r>
+      <w:proofErr w:type="spellStart"/>
+      <w:r>
+        <w:t>poleg</w:t>
+      </w:r>
+      <w:proofErr w:type="spellEnd"/>
+      <w:r>
+        <w:t xml:space="preserve"> </w:t>
+      </w:r>
+      <w:proofErr w:type="spellStart"/>
+      <w:r>
+        <w:t>shem</w:t>
+      </w:r>
+      <w:proofErr w:type="spellEnd"/>
+      <w:r>
+        <w:t xml:space="preserve"> </w:t>
+      </w:r>
+      <w:proofErr w:type="spellStart"/>
+      <w:r>
+        <w:t>naredili</w:t>
+      </w:r>
+      <w:proofErr w:type="spellEnd"/>
+      <w:r>
+        <w:t xml:space="preserve"> </w:t>
+      </w:r>
+      <w:proofErr w:type="spellStart"/>
+      <w:r>
+        <w:t>tudi</w:t>
+      </w:r>
+      <w:proofErr w:type="spellEnd"/>
+      <w:r>
+        <w:t xml:space="preserve"> </w:t>
+      </w:r>
+      <w:proofErr w:type="spellStart"/>
+      <w:r>
+        <w:t>razrede</w:t>
+      </w:r>
+      <w:proofErr w:type="spellEnd"/>
+      <w:r>
+        <w:t xml:space="preserve">, interface in </w:t>
+      </w:r>
+      <w:proofErr w:type="spellStart"/>
+      <w:r>
+        <w:t>game.ts</w:t>
+      </w:r>
+      <w:proofErr w:type="spellEnd"/>
+      <w:r>
+        <w:t xml:space="preserve">, ki </w:t>
+      </w:r>
+      <w:proofErr w:type="spellStart"/>
+      <w:r>
+        <w:t>vodi</w:t>
+      </w:r>
+      <w:proofErr w:type="spellEnd"/>
+      <w:r>
+        <w:t xml:space="preserve"> </w:t>
+      </w:r>
+      <w:proofErr w:type="spellStart"/>
+      <w:r>
+        <w:t>celotno</w:t>
+      </w:r>
+      <w:proofErr w:type="spellEnd"/>
+      <w:r>
+        <w:t xml:space="preserve"> </w:t>
+      </w:r>
+      <w:proofErr w:type="spellStart"/>
+      <w:r>
+        <w:t>igro</w:t>
+      </w:r>
+      <w:proofErr w:type="spellEnd"/>
+    </w:p>
+    <w:p>
+      <w:pPr>
+        <w:pStyle w:val="ListParagraph"/>
+        <w:numPr>
+          <w:ilvl w:val="0"/>
+          <w:numId w:val="9"/>
+        </w:numPr>
+      </w:pPr>
+      <w:proofErr w:type="spellStart"/>
+      <w:r>
+        <w:t>Generatorje</w:t>
+      </w:r>
+      <w:proofErr w:type="spellEnd"/>
+      <w:r>
+        <w:t xml:space="preserve"> </w:t>
+      </w:r>
+      <w:proofErr w:type="spellStart"/>
+      <w:r>
+        <w:t>vprašanj</w:t>
+      </w:r>
+      <w:proofErr w:type="spellEnd"/>
+      <w:r>
+        <w:t xml:space="preserve"> za </w:t>
+      </w:r>
+      <w:proofErr w:type="spellStart"/>
+      <w:r>
+        <w:t>matematiko</w:t>
+      </w:r>
+      <w:proofErr w:type="spellEnd"/>
+      <w:r>
+        <w:t xml:space="preserve">, glede </w:t>
+      </w:r>
+      <w:proofErr w:type="spellStart"/>
+      <w:r>
+        <w:t>na</w:t>
+      </w:r>
+      <w:proofErr w:type="spellEnd"/>
+      <w:r>
+        <w:t xml:space="preserve"> </w:t>
+      </w:r>
+      <w:proofErr w:type="spellStart"/>
+      <w:r>
+        <w:t>stopnjo</w:t>
+      </w:r>
+      <w:proofErr w:type="spellEnd"/>
+      <w:r>
+        <w:t xml:space="preserve"> se </w:t>
+      </w:r>
+      <w:proofErr w:type="spellStart"/>
+      <w:r>
+        <w:t>generirajo</w:t>
+      </w:r>
+      <w:proofErr w:type="spellEnd"/>
+      <w:r>
+        <w:t xml:space="preserve"> </w:t>
+      </w:r>
+      <w:proofErr w:type="spellStart"/>
+      <w:r>
+        <w:t>naključna</w:t>
+      </w:r>
+      <w:proofErr w:type="spellEnd"/>
+      <w:r>
+        <w:t xml:space="preserve"> </w:t>
+      </w:r>
+      <w:proofErr w:type="spellStart"/>
+      <w:r>
+        <w:t>vprašanja</w:t>
+      </w:r>
+      <w:proofErr w:type="spellEnd"/>
+      <w:r>
+        <w:t xml:space="preserve"> po </w:t>
+      </w:r>
+      <w:proofErr w:type="spellStart"/>
+      <w:r>
+        <w:t>sklopih</w:t>
+      </w:r>
+      <w:proofErr w:type="spellEnd"/>
+    </w:p>
+    <w:p>
+      <w:pPr>
+        <w:pStyle w:val="ListParagraph"/>
+        <w:numPr>
+          <w:ilvl w:val="0"/>
+          <w:numId w:val="9"/>
+        </w:numPr>
+      </w:pPr>
+      <w:proofErr w:type="spellStart"/>
+      <w:r>
+        <w:t>Osnovna</w:t>
+      </w:r>
+      <w:proofErr w:type="spellEnd"/>
+      <w:r>
+        <w:t xml:space="preserve"> </w:t>
+      </w:r>
+      <w:proofErr w:type="spellStart"/>
+      <w:r>
+        <w:t>implementacija</w:t>
+      </w:r>
+      <w:proofErr w:type="spellEnd"/>
+      <w:r>
+        <w:t xml:space="preserve"> </w:t>
+      </w:r>
+      <w:proofErr w:type="spellStart"/>
+      <w:r>
+        <w:t>težavnosti</w:t>
+      </w:r>
+      <w:proofErr w:type="spellEnd"/>
+      <w:r>
+        <w:t xml:space="preserve"> </w:t>
+      </w:r>
+      <w:proofErr w:type="spellStart"/>
+      <w:r>
+        <w:t>vprašanj</w:t>
+      </w:r>
+      <w:proofErr w:type="spellEnd"/>
+      <w:r>
+        <w:t xml:space="preserve">, </w:t>
+      </w:r>
+      <w:proofErr w:type="spellStart"/>
+      <w:r>
+        <w:t>lahko</w:t>
+      </w:r>
+      <w:proofErr w:type="spellEnd"/>
+      <w:r>
+        <w:t xml:space="preserve"> se </w:t>
+      </w:r>
+      <w:proofErr w:type="spellStart"/>
+      <w:r>
+        <w:t>določi</w:t>
+      </w:r>
+      <w:proofErr w:type="spellEnd"/>
+      <w:r>
+        <w:t xml:space="preserve"> </w:t>
+      </w:r>
+      <w:proofErr w:type="spellStart"/>
+      <w:r>
+        <w:t>ob</w:t>
+      </w:r>
+      <w:proofErr w:type="spellEnd"/>
+      <w:r>
+        <w:t xml:space="preserve"> </w:t>
+      </w:r>
+      <w:proofErr w:type="spellStart"/>
+      <w:r>
+        <w:t>ustvarjanju</w:t>
+      </w:r>
+      <w:proofErr w:type="spellEnd"/>
+      <w:r>
+        <w:t xml:space="preserve"> </w:t>
+      </w:r>
+      <w:proofErr w:type="spellStart"/>
+      <w:r>
+        <w:t>kviza</w:t>
+      </w:r>
+      <w:proofErr w:type="spellEnd"/>
+      <w:r>
+        <w:t xml:space="preserve">, </w:t>
+      </w:r>
+      <w:proofErr w:type="spellStart"/>
+      <w:r>
+        <w:t>višja</w:t>
+      </w:r>
+      <w:proofErr w:type="spellEnd"/>
+      <w:r>
+        <w:t xml:space="preserve"> </w:t>
+      </w:r>
+      <w:proofErr w:type="spellStart"/>
+      <w:r>
+        <w:t>težavnost</w:t>
+      </w:r>
+      <w:proofErr w:type="spellEnd"/>
+      <w:r>
+        <w:t xml:space="preserve"> </w:t>
+      </w:r>
+      <w:proofErr w:type="spellStart"/>
+      <w:r>
+        <w:t>pomeni</w:t>
+      </w:r>
+      <w:proofErr w:type="spellEnd"/>
+      <w:r>
+        <w:t xml:space="preserve"> </w:t>
+      </w:r>
+      <w:proofErr w:type="spellStart"/>
+      <w:r>
+        <w:t>zahtevnejše</w:t>
+      </w:r>
+      <w:proofErr w:type="spellEnd"/>
+      <w:r>
+        <w:t xml:space="preserve"> </w:t>
+      </w:r>
+      <w:proofErr w:type="spellStart"/>
+      <w:r>
+        <w:t>naloge</w:t>
+      </w:r>
+      <w:proofErr w:type="spellEnd"/>
+      <w:r>
+        <w:t xml:space="preserve"> in </w:t>
+      </w:r>
+      <w:proofErr w:type="spellStart"/>
+      <w:r>
+        <w:t>manj</w:t>
+      </w:r>
+      <w:proofErr w:type="spellEnd"/>
+      <w:r>
+        <w:t xml:space="preserve"> </w:t>
+      </w:r>
+      <w:proofErr w:type="spellStart"/>
+      <w:r>
+        <w:t>časa</w:t>
+      </w:r>
+      <w:proofErr w:type="spellEnd"/>
+      <w:r>
+        <w:t xml:space="preserve"> za </w:t>
+      </w:r>
+      <w:proofErr w:type="spellStart"/>
+      <w:r>
+        <w:t>odgovor</w:t>
+      </w:r>
+      <w:proofErr w:type="spellEnd"/>
+    </w:p>
+    <w:p>
+      <w:pPr>
+        <w:pStyle w:val="ListParagraph"/>
+        <w:numPr>
+          <w:ilvl w:val="0"/>
+          <w:numId w:val="9"/>
+        </w:numPr>
+      </w:pPr>
+      <w:proofErr w:type="spellStart"/>
+      <w:r>
+        <w:t>Navigacijo</w:t>
+      </w:r>
+      <w:proofErr w:type="spellEnd"/>
+      <w:r>
+        <w:t xml:space="preserve">, </w:t>
+      </w:r>
+      <w:proofErr w:type="spellStart"/>
+      <w:r>
+        <w:t>razred</w:t>
+      </w:r>
+      <w:r>
+        <w:t>e</w:t>
+      </w:r>
+      <w:proofErr w:type="spellEnd"/>
+      <w:r>
+        <w:t xml:space="preserve">, </w:t>
+      </w:r>
+      <w:proofErr w:type="spellStart"/>
+      <w:r>
+        <w:t>enume</w:t>
+      </w:r>
+      <w:proofErr w:type="spellEnd"/>
+      <w:r>
+        <w:t xml:space="preserve"> in </w:t>
+      </w:r>
+      <w:proofErr w:type="spellStart"/>
+      <w:r>
+        <w:t>api</w:t>
+      </w:r>
+      <w:proofErr w:type="spellEnd"/>
+      <w:r>
+        <w:t xml:space="preserve"> za </w:t>
+      </w:r>
+      <w:proofErr w:type="spellStart"/>
+      <w:r>
+        <w:t>ustvarjanje</w:t>
+      </w:r>
+      <w:proofErr w:type="spellEnd"/>
+      <w:r>
+        <w:t xml:space="preserve"> </w:t>
+      </w:r>
+      <w:proofErr w:type="spellStart"/>
+      <w:r>
+        <w:t>kviza</w:t>
+      </w:r>
+      <w:proofErr w:type="spellEnd"/>
+      <w:r>
+        <w:t xml:space="preserve"> </w:t>
+      </w:r>
+      <w:proofErr w:type="spellStart"/>
+      <w:r>
+        <w:t>preko</w:t>
+      </w:r>
+      <w:proofErr w:type="spellEnd"/>
+      <w:r>
+        <w:t xml:space="preserve"> http </w:t>
+      </w:r>
+      <w:proofErr w:type="spellStart"/>
+      <w:r>
+        <w:t>strežnika</w:t>
+      </w:r>
+      <w:proofErr w:type="spellEnd"/>
+    </w:p>
+    <w:p>
+      <w:pPr>
+        <w:pStyle w:val="ListParagraph"/>
+        <w:numPr>
+          <w:ilvl w:val="0"/>
+          <w:numId w:val="9"/>
+        </w:numPr>
+      </w:pPr>
+      <w:proofErr w:type="spellStart"/>
+      <w:r>
+        <w:t>Domača</w:t>
+      </w:r>
+      <w:proofErr w:type="spellEnd"/>
+      <w:r>
+        <w:t xml:space="preserve"> </w:t>
+      </w:r>
+      <w:proofErr w:type="spellStart"/>
+      <w:r>
+        <w:t>stran</w:t>
+      </w:r>
+      <w:proofErr w:type="spellEnd"/>
+      <w:r>
+        <w:t xml:space="preserve">, </w:t>
+      </w:r>
+      <w:proofErr w:type="spellStart"/>
+      <w:r>
+        <w:t>stran</w:t>
+      </w:r>
+      <w:proofErr w:type="spellEnd"/>
+      <w:r>
+        <w:t xml:space="preserve"> za </w:t>
+      </w:r>
+      <w:proofErr w:type="spellStart"/>
+      <w:r>
+        <w:t>pridružitev</w:t>
+      </w:r>
+      <w:proofErr w:type="spellEnd"/>
+      <w:r>
+        <w:t xml:space="preserve"> </w:t>
+      </w:r>
+      <w:proofErr w:type="spellStart"/>
+      <w:r>
+        <w:t>kvizu</w:t>
+      </w:r>
+      <w:proofErr w:type="spellEnd"/>
+      <w:r>
+        <w:t xml:space="preserve">, </w:t>
+      </w:r>
+      <w:proofErr w:type="spellStart"/>
+      <w:r>
+        <w:t>stran</w:t>
+      </w:r>
+      <w:proofErr w:type="spellEnd"/>
+      <w:r>
+        <w:t xml:space="preserve"> za </w:t>
+      </w:r>
+      <w:proofErr w:type="spellStart"/>
+      <w:r>
+        <w:t>ustvarjanje</w:t>
+      </w:r>
+      <w:proofErr w:type="spellEnd"/>
+      <w:r>
+        <w:t xml:space="preserve"> </w:t>
+      </w:r>
+      <w:proofErr w:type="spellStart"/>
+      <w:r>
+        <w:t>kviza</w:t>
+      </w:r>
+      <w:proofErr w:type="spellEnd"/>
+    </w:p>
+    <w:p>
+      <w:pPr>
+        <w:pStyle w:val="ListParagraph"/>
+        <w:numPr>
+          <w:ilvl w:val="0"/>
+          <w:numId w:val="9"/>
+        </w:numPr>
+      </w:pPr>
+      <w:proofErr w:type="spellStart"/>
+      <w:r>
+        <w:t>Vtičnice</w:t>
+      </w:r>
+      <w:proofErr w:type="spellEnd"/>
+      <w:r>
+        <w:t xml:space="preserve"> </w:t>
+      </w:r>
+      <w:proofErr w:type="spellStart"/>
+      <w:r>
+        <w:t>pravilno</w:t>
+      </w:r>
+      <w:proofErr w:type="spellEnd"/>
+      <w:r>
+        <w:t xml:space="preserve"> </w:t>
+      </w:r>
+      <w:proofErr w:type="spellStart"/>
+      <w:r>
+        <w:t>komunicirajo</w:t>
+      </w:r>
+      <w:proofErr w:type="spellEnd"/>
+      <w:r>
+        <w:t xml:space="preserve"> z </w:t>
+      </w:r>
+      <w:proofErr w:type="spellStart"/>
+      <w:r>
+        <w:t>zaledjem</w:t>
+      </w:r>
+      <w:proofErr w:type="spellEnd"/>
+      <w:r>
+        <w:t xml:space="preserve">, </w:t>
+      </w:r>
+      <w:proofErr w:type="spellStart"/>
+      <w:r>
+        <w:t>igralci</w:t>
+      </w:r>
+      <w:proofErr w:type="spellEnd"/>
+      <w:r>
+        <w:t xml:space="preserve"> se </w:t>
+      </w:r>
+      <w:proofErr w:type="spellStart"/>
+      <w:r>
+        <w:t>lahko</w:t>
+      </w:r>
+      <w:proofErr w:type="spellEnd"/>
+      <w:r>
+        <w:t xml:space="preserve"> </w:t>
+      </w:r>
+      <w:proofErr w:type="spellStart"/>
+      <w:r>
+        <w:t>pridružijo</w:t>
+      </w:r>
+      <w:proofErr w:type="spellEnd"/>
+      <w:r>
+        <w:t xml:space="preserve"> </w:t>
+      </w:r>
+      <w:proofErr w:type="spellStart"/>
+      <w:r>
+        <w:t>kvizom</w:t>
       </w:r>
       <w:proofErr w:type="spellEnd"/>
     </w:p>
@@ -1843,6 +2834,119 @@
 <file path=word/numbering.xml><?xml version="1.0" encoding="utf-8"?>
 <w:numbering xmlns:wpc="http://schemas.microsoft.com/office/word/2010/wordprocessingCanvas" xmlns:cx="http://schemas.microsoft.com/office/drawing/2014/chartex" xmlns:cx1="http://schemas.microsoft.com/office/drawing/2015/9/8/chartex" xmlns:cx2="http://schemas.microsoft.com/office/drawing/2015/10/21/chartex" xmlns:cx3="http://schemas.microsoft.com/office/drawing/2016/5/9/chartex" xmlns:cx4="http://schemas.microsoft.com/office/drawing/2016/5/10/chartex" xmlns:cx5="http://schemas.microsoft.com/office/drawing/2016/5/11/chartex" xmlns:cx6="http://schemas.microsoft.com/office/drawing/2016/5/12/chartex" xmlns:cx7="http://schemas.microsoft.com/office/drawing/2016/5/13/chartex" xmlns:cx8="http://schemas.microsoft.com/office/drawing/2016/5/14/chartex" xmlns:mc="http://schemas.openxmlformats.org/markup-compatibility/2006" xmlns:aink="http://schemas.microsoft.com/office/drawing/2016/ink" xmlns:am3d="http://schemas.microsoft.com/office/drawing/2017/model3d" xmlns:o="urn:schemas-microsoft-com:office:office" xmlns:oel="http://schemas.microsoft.com/office/2019/extlst" xmlns:r="http://schemas.openxmlformats.org/officeDocument/2006/relationships" xmlns:m="http://schemas.openxmlformats.org/officeDocument/2006/math" xmlns:v="urn:schemas-microsoft-com:vml" xmlns:wp14="http://schemas.microsoft.com/office/word/2010/wordprocessingDrawing" xmlns:wp="http://schemas.openxmlformats.org/drawingml/2006/wordprocessingDrawing" xmlns:w10="urn:schemas-microsoft-com:office:word" xmlns:w="http://schemas.openxmlformats.org/wordprocessingml/2006/main" xmlns:w14="http://schemas.microsoft.com/office/word/2010/wordml" xmlns:w15="http://schemas.microsoft.com/office/word/2012/wordml" xmlns:w16cex="http://schemas.microsoft.com/office/word/2018/wordml/cex" xmlns:w16cid="http://schemas.microsoft.com/office/word/2016/wordml/cid" xmlns:w16="http://schemas.microsoft.com/office/word/2018/wordml" xmlns:w16du="http://schemas.microsoft.com/office/word/2023/wordml/word16du" xmlns:w16sdtdh="http://schemas.microsoft.com/office/word/2020/wordml/sdtdatahash" xmlns:w16sdtfl="http://schemas.microsoft.com/office/word/2024/wordml/sdtformatlock" xmlns:w16se="http://schemas.microsoft.com/office/word/2015/wordml/symex" xmlns:wpg="http://schemas.microsoft.com/office/word/2010/wordprocessingGroup" xmlns:wpi="http://schemas.microsoft.com/office/word/2010/wordprocessingInk" xmlns:wne="http://schemas.microsoft.com/office/word/2006/wordml" xmlns:wps="http://schemas.microsoft.com/office/word/2010/wordprocessingShape" mc:Ignorable="w14 w15 w16se w16cid w16 w16cex w16sdtdh w16sdtfl w16du wp14">
   <w:abstractNum w:abstractNumId="0" w15:restartNumberingAfterBreak="0">
+    <w:nsid w:val="176945AA"/>
+    <w:multiLevelType w:val="hybridMultilevel"/>
+    <w:tmpl w:val="E856D124"/>
+    <w:lvl w:ilvl="0" w:tplc="04240001">
+      <w:start w:val="1"/>
+      <w:numFmt w:val="bullet"/>
+      <w:lvlText w:val=""/>
+      <w:lvlJc w:val="left"/>
+      <w:pPr>
+        <w:ind w:left="720" w:hanging="360"/>
+      </w:pPr>
+      <w:rPr>
+        <w:rFonts w:ascii="Symbol" w:hAnsi="Symbol" w:hint="default"/>
+      </w:rPr>
+    </w:lvl>
+    <w:lvl w:ilvl="1" w:tplc="04240003" w:tentative="1">
+      <w:start w:val="1"/>
+      <w:numFmt w:val="bullet"/>
+      <w:lvlText w:val="o"/>
+      <w:lvlJc w:val="left"/>
+      <w:pPr>
+        <w:ind w:left="1440" w:hanging="360"/>
+      </w:pPr>
+      <w:rPr>
+        <w:rFonts w:ascii="Courier New" w:hAnsi="Courier New" w:cs="Courier New" w:hint="default"/>
+      </w:rPr>
+    </w:lvl>
+    <w:lvl w:ilvl="2" w:tplc="04240005" w:tentative="1">
+      <w:start w:val="1"/>
+      <w:numFmt w:val="bullet"/>
+      <w:lvlText w:val=""/>
+      <w:lvlJc w:val="left"/>
+      <w:pPr>
+        <w:ind w:left="2160" w:hanging="360"/>
+      </w:pPr>
+      <w:rPr>
+        <w:rFonts w:ascii="Wingdings" w:hAnsi="Wingdings" w:hint="default"/>
+      </w:rPr>
+    </w:lvl>
+    <w:lvl w:ilvl="3" w:tplc="04240001" w:tentative="1">
+      <w:start w:val="1"/>
+      <w:numFmt w:val="bullet"/>
+      <w:lvlText w:val=""/>
+      <w:lvlJc w:val="left"/>
+      <w:pPr>
+        <w:ind w:left="2880" w:hanging="360"/>
+      </w:pPr>
+      <w:rPr>
+        <w:rFonts w:ascii="Symbol" w:hAnsi="Symbol" w:hint="default"/>
+      </w:rPr>
+    </w:lvl>
+    <w:lvl w:ilvl="4" w:tplc="04240003" w:tentative="1">
+      <w:start w:val="1"/>
+      <w:numFmt w:val="bullet"/>
+      <w:lvlText w:val="o"/>
+      <w:lvlJc w:val="left"/>
+      <w:pPr>
+        <w:ind w:left="3600" w:hanging="360"/>
+      </w:pPr>
+      <w:rPr>
+        <w:rFonts w:ascii="Courier New" w:hAnsi="Courier New" w:cs="Courier New" w:hint="default"/>
+      </w:rPr>
+    </w:lvl>
+    <w:lvl w:ilvl="5" w:tplc="04240005" w:tentative="1">
+      <w:start w:val="1"/>
+      <w:numFmt w:val="bullet"/>
+      <w:lvlText w:val=""/>
+      <w:lvlJc w:val="left"/>
+      <w:pPr>
+        <w:ind w:left="4320" w:hanging="360"/>
+      </w:pPr>
+      <w:rPr>
+        <w:rFonts w:ascii="Wingdings" w:hAnsi="Wingdings" w:hint="default"/>
+      </w:rPr>
+    </w:lvl>
+    <w:lvl w:ilvl="6" w:tplc="04240001" w:tentative="1">
+      <w:start w:val="1"/>
+      <w:numFmt w:val="bullet"/>
+      <w:lvlText w:val=""/>
+      <w:lvlJc w:val="left"/>
+      <w:pPr>
+        <w:ind w:left="5040" w:hanging="360"/>
+      </w:pPr>
+      <w:rPr>
+        <w:rFonts w:ascii="Symbol" w:hAnsi="Symbol" w:hint="default"/>
+      </w:rPr>
+    </w:lvl>
+    <w:lvl w:ilvl="7" w:tplc="04240003" w:tentative="1">
+      <w:start w:val="1"/>
+      <w:numFmt w:val="bullet"/>
+      <w:lvlText w:val="o"/>
+      <w:lvlJc w:val="left"/>
+      <w:pPr>
+        <w:ind w:left="5760" w:hanging="360"/>
+      </w:pPr>
+      <w:rPr>
+        <w:rFonts w:ascii="Courier New" w:hAnsi="Courier New" w:cs="Courier New" w:hint="default"/>
+      </w:rPr>
+    </w:lvl>
+    <w:lvl w:ilvl="8" w:tplc="04240005" w:tentative="1">
+      <w:start w:val="1"/>
+      <w:numFmt w:val="bullet"/>
+      <w:lvlText w:val=""/>
+      <w:lvlJc w:val="left"/>
+      <w:pPr>
+        <w:ind w:left="6480" w:hanging="360"/>
+      </w:pPr>
+      <w:rPr>
+        <w:rFonts w:ascii="Wingdings" w:hAnsi="Wingdings" w:hint="default"/>
+      </w:rPr>
+    </w:lvl>
+  </w:abstractNum>
+  <w:abstractNum w:abstractNumId="1" w15:restartNumberingAfterBreak="0">
     <w:nsid w:val="1BBDA7B0"/>
     <w:multiLevelType w:val="hybridMultilevel"/>
     <w:tmpl w:val="FFFFFFFF"/>
@@ -1955,7 +3059,7 @@
       </w:rPr>
     </w:lvl>
   </w:abstractNum>
-  <w:abstractNum w:abstractNumId="1" w15:restartNumberingAfterBreak="0">
+  <w:abstractNum w:abstractNumId="2" w15:restartNumberingAfterBreak="0">
     <w:nsid w:val="3AACDB2F"/>
     <w:multiLevelType w:val="hybridMultilevel"/>
     <w:tmpl w:val="3A2AD88C"/>
@@ -2068,7 +3172,7 @@
       </w:rPr>
     </w:lvl>
   </w:abstractNum>
-  <w:abstractNum w:abstractNumId="2" w15:restartNumberingAfterBreak="0">
+  <w:abstractNum w:abstractNumId="3" w15:restartNumberingAfterBreak="0">
     <w:nsid w:val="4D6B9577"/>
     <w:multiLevelType w:val="hybridMultilevel"/>
     <w:tmpl w:val="B4A47E54"/>
@@ -2181,7 +3285,7 @@
       </w:rPr>
     </w:lvl>
   </w:abstractNum>
-  <w:abstractNum w:abstractNumId="3" w15:restartNumberingAfterBreak="0">
+  <w:abstractNum w:abstractNumId="4" w15:restartNumberingAfterBreak="0">
     <w:nsid w:val="5D722FB1"/>
     <w:multiLevelType w:val="hybridMultilevel"/>
     <w:tmpl w:val="0A083510"/>
@@ -2294,7 +3398,7 @@
       </w:rPr>
     </w:lvl>
   </w:abstractNum>
-  <w:abstractNum w:abstractNumId="4" w15:restartNumberingAfterBreak="0">
+  <w:abstractNum w:abstractNumId="5" w15:restartNumberingAfterBreak="0">
     <w:nsid w:val="6A2B5171"/>
     <w:multiLevelType w:val="hybridMultilevel"/>
     <w:tmpl w:val="336E7B9E"/>
@@ -2407,7 +3511,7 @@
       </w:rPr>
     </w:lvl>
   </w:abstractNum>
-  <w:abstractNum w:abstractNumId="5" w15:restartNumberingAfterBreak="0">
+  <w:abstractNum w:abstractNumId="6" w15:restartNumberingAfterBreak="0">
     <w:nsid w:val="6C6DD2EA"/>
     <w:multiLevelType w:val="hybridMultilevel"/>
     <w:tmpl w:val="FFFFFFFF"/>
@@ -2520,7 +3624,7 @@
       </w:rPr>
     </w:lvl>
   </w:abstractNum>
-  <w:abstractNum w:abstractNumId="6" w15:restartNumberingAfterBreak="0">
+  <w:abstractNum w:abstractNumId="7" w15:restartNumberingAfterBreak="0">
     <w:nsid w:val="6D3349DC"/>
     <w:multiLevelType w:val="hybridMultilevel"/>
     <w:tmpl w:val="9170F094"/>
@@ -2633,14 +3737,14 @@
       </w:rPr>
     </w:lvl>
   </w:abstractNum>
-  <w:abstractNum w:abstractNumId="7" w15:restartNumberingAfterBreak="0">
+  <w:abstractNum w:abstractNumId="8" w15:restartNumberingAfterBreak="0">
     <w:nsid w:val="70F41CF6"/>
     <w:multiLevelType w:val="multilevel"/>
     <w:tmpl w:val="20000025"/>
     <w:lvl w:ilvl="0">
       <w:start w:val="1"/>
       <w:numFmt w:val="decimal"/>
-      <w:pStyle w:val="Naslov1"/>
+      <w:pStyle w:val="Heading1"/>
       <w:lvlText w:val="%1"/>
       <w:lvlJc w:val="left"/>
       <w:pPr>
@@ -2650,7 +3754,7 @@
     <w:lvl w:ilvl="1">
       <w:start w:val="1"/>
       <w:numFmt w:val="decimal"/>
-      <w:pStyle w:val="Naslov2"/>
+      <w:pStyle w:val="Heading2"/>
       <w:lvlText w:val="%1.%2"/>
       <w:lvlJc w:val="left"/>
       <w:pPr>
@@ -2660,7 +3764,7 @@
     <w:lvl w:ilvl="2">
       <w:start w:val="1"/>
       <w:numFmt w:val="decimal"/>
-      <w:pStyle w:val="Naslov3"/>
+      <w:pStyle w:val="Heading3"/>
       <w:lvlText w:val="%1.%2.%3"/>
       <w:lvlJc w:val="left"/>
       <w:pPr>
@@ -2670,7 +3774,7 @@
     <w:lvl w:ilvl="3">
       <w:start w:val="1"/>
       <w:numFmt w:val="decimal"/>
-      <w:pStyle w:val="Naslov4"/>
+      <w:pStyle w:val="Heading4"/>
       <w:lvlText w:val="%1.%2.%3.%4"/>
       <w:lvlJc w:val="left"/>
       <w:pPr>
@@ -2680,7 +3784,7 @@
     <w:lvl w:ilvl="4">
       <w:start w:val="1"/>
       <w:numFmt w:val="decimal"/>
-      <w:pStyle w:val="Naslov5"/>
+      <w:pStyle w:val="Heading5"/>
       <w:lvlText w:val="%1.%2.%3.%4.%5"/>
       <w:lvlJc w:val="left"/>
       <w:pPr>
@@ -2690,7 +3794,7 @@
     <w:lvl w:ilvl="5">
       <w:start w:val="1"/>
       <w:numFmt w:val="decimal"/>
-      <w:pStyle w:val="Naslov6"/>
+      <w:pStyle w:val="Heading6"/>
       <w:lvlText w:val="%1.%2.%3.%4.%5.%6"/>
       <w:lvlJc w:val="left"/>
       <w:pPr>
@@ -2700,7 +3804,7 @@
     <w:lvl w:ilvl="6">
       <w:start w:val="1"/>
       <w:numFmt w:val="decimal"/>
-      <w:pStyle w:val="Naslov7"/>
+      <w:pStyle w:val="Heading7"/>
       <w:lvlText w:val="%1.%2.%3.%4.%5.%6.%7"/>
       <w:lvlJc w:val="left"/>
       <w:pPr>
@@ -2710,7 +3814,7 @@
     <w:lvl w:ilvl="7">
       <w:start w:val="1"/>
       <w:numFmt w:val="decimal"/>
-      <w:pStyle w:val="Naslov8"/>
+      <w:pStyle w:val="Heading8"/>
       <w:lvlText w:val="%1.%2.%3.%4.%5.%6.%7.%8"/>
       <w:lvlJc w:val="left"/>
       <w:pPr>
@@ -2720,7 +3824,7 @@
     <w:lvl w:ilvl="8">
       <w:start w:val="1"/>
       <w:numFmt w:val="decimal"/>
-      <w:pStyle w:val="Naslov9"/>
+      <w:pStyle w:val="Heading9"/>
       <w:lvlText w:val="%1.%2.%3.%4.%5.%6.%7.%8.%9"/>
       <w:lvlJc w:val="left"/>
       <w:pPr>
@@ -2729,28 +3833,31 @@
     </w:lvl>
   </w:abstractNum>
   <w:num w:numId="1" w16cid:durableId="930505480">
+    <w:abstractNumId w:val="5"/>
+  </w:num>
+  <w:num w:numId="2" w16cid:durableId="2048026122">
     <w:abstractNumId w:val="4"/>
   </w:num>
-  <w:num w:numId="2" w16cid:durableId="2048026122">
+  <w:num w:numId="3" w16cid:durableId="376051005">
+    <w:abstractNumId w:val="1"/>
+  </w:num>
+  <w:num w:numId="4" w16cid:durableId="359284668">
+    <w:abstractNumId w:val="6"/>
+  </w:num>
+  <w:num w:numId="5" w16cid:durableId="2004820839">
+    <w:abstractNumId w:val="2"/>
+  </w:num>
+  <w:num w:numId="6" w16cid:durableId="744230539">
     <w:abstractNumId w:val="3"/>
   </w:num>
-  <w:num w:numId="3" w16cid:durableId="376051005">
-    <w:abstractNumId w:val="0"/>
-  </w:num>
-  <w:num w:numId="4" w16cid:durableId="359284668">
-    <w:abstractNumId w:val="5"/>
-  </w:num>
-  <w:num w:numId="5" w16cid:durableId="2004820839">
-    <w:abstractNumId w:val="1"/>
-  </w:num>
-  <w:num w:numId="6" w16cid:durableId="744230539">
-    <w:abstractNumId w:val="2"/>
-  </w:num>
   <w:num w:numId="7" w16cid:durableId="943996324">
-    <w:abstractNumId w:val="6"/>
+    <w:abstractNumId w:val="7"/>
   </w:num>
   <w:num w:numId="8" w16cid:durableId="49118872">
-    <w:abstractNumId w:val="7"/>
+    <w:abstractNumId w:val="8"/>
+  </w:num>
+  <w:num w:numId="9" w16cid:durableId="130949856">
+    <w:abstractNumId w:val="0"/>
   </w:num>
 </w:numbering>
 </file>
@@ -2764,7 +3871,7 @@
         <w:kern w:val="2"/>
         <w:sz w:val="24"/>
         <w:szCs w:val="24"/>
-        <w:lang w:val="en-SI" w:eastAsia="en-US" w:bidi="ar-SA"/>
+        <w:lang w:eastAsia="en-US" w:bidi="ar-SA"/>
         <w14:ligatures w14:val="standardContextual"/>
       </w:rPr>
     </w:rPrDefault>
@@ -3152,7 +4259,7 @@
     <w:lsdException w:name="Unresolved Mention" w:semiHidden="1" w:unhideWhenUsed="1"/>
     <w:lsdException w:name="Smart Link" w:semiHidden="1" w:unhideWhenUsed="1"/>
   </w:latentStyles>
-  <w:style w:type="paragraph" w:default="1" w:styleId="Navaden">
+  <w:style w:type="paragraph" w:default="1" w:styleId="Normal">
     <w:name w:val="Normal"/>
     <w:qFormat/>
     <w:rsid w:val="001863EF"/>
@@ -3160,11 +4267,11 @@
       <w:lang w:val="en-US"/>
     </w:rPr>
   </w:style>
-  <w:style w:type="paragraph" w:styleId="Naslov1">
+  <w:style w:type="paragraph" w:styleId="Heading1">
     <w:name w:val="heading 1"/>
-    <w:basedOn w:val="Navaden"/>
-    <w:next w:val="Navaden"/>
-    <w:link w:val="Naslov1Znak"/>
+    <w:basedOn w:val="Normal"/>
+    <w:next w:val="Normal"/>
+    <w:link w:val="Heading1Char"/>
     <w:uiPriority w:val="9"/>
     <w:qFormat/>
     <w:rsid w:val="004A597C"/>
@@ -3184,11 +4291,11 @@
       <w:szCs w:val="40"/>
     </w:rPr>
   </w:style>
-  <w:style w:type="paragraph" w:styleId="Naslov2">
+  <w:style w:type="paragraph" w:styleId="Heading2">
     <w:name w:val="heading 2"/>
-    <w:basedOn w:val="Navaden"/>
-    <w:next w:val="Navaden"/>
-    <w:link w:val="Naslov2Znak"/>
+    <w:basedOn w:val="Normal"/>
+    <w:next w:val="Normal"/>
+    <w:link w:val="Heading2Char"/>
     <w:uiPriority w:val="9"/>
     <w:unhideWhenUsed/>
     <w:qFormat/>
@@ -3210,11 +4317,11 @@
       <w:szCs w:val="32"/>
     </w:rPr>
   </w:style>
-  <w:style w:type="paragraph" w:styleId="Naslov3">
+  <w:style w:type="paragraph" w:styleId="Heading3">
     <w:name w:val="heading 3"/>
-    <w:basedOn w:val="Navaden"/>
-    <w:next w:val="Navaden"/>
-    <w:link w:val="Naslov3Znak"/>
+    <w:basedOn w:val="Normal"/>
+    <w:next w:val="Normal"/>
+    <w:link w:val="Heading3Char"/>
     <w:uiPriority w:val="9"/>
     <w:unhideWhenUsed/>
     <w:qFormat/>
@@ -3236,11 +4343,11 @@
       <w:szCs w:val="28"/>
     </w:rPr>
   </w:style>
-  <w:style w:type="paragraph" w:styleId="Naslov4">
+  <w:style w:type="paragraph" w:styleId="Heading4">
     <w:name w:val="heading 4"/>
-    <w:basedOn w:val="Navaden"/>
-    <w:next w:val="Navaden"/>
-    <w:link w:val="Naslov4Znak"/>
+    <w:basedOn w:val="Normal"/>
+    <w:next w:val="Normal"/>
+    <w:link w:val="Heading4Char"/>
     <w:uiPriority w:val="9"/>
     <w:semiHidden/>
     <w:unhideWhenUsed/>
@@ -3263,11 +4370,11 @@
       <w:color w:val="2F5496" w:themeColor="accent1" w:themeShade="BF"/>
     </w:rPr>
   </w:style>
-  <w:style w:type="paragraph" w:styleId="Naslov5">
+  <w:style w:type="paragraph" w:styleId="Heading5">
     <w:name w:val="heading 5"/>
-    <w:basedOn w:val="Navaden"/>
-    <w:next w:val="Navaden"/>
-    <w:link w:val="Naslov5Znak"/>
+    <w:basedOn w:val="Normal"/>
+    <w:next w:val="Normal"/>
+    <w:link w:val="Heading5Char"/>
     <w:uiPriority w:val="9"/>
     <w:semiHidden/>
     <w:unhideWhenUsed/>
@@ -3288,11 +4395,11 @@
       <w:color w:val="2F5496" w:themeColor="accent1" w:themeShade="BF"/>
     </w:rPr>
   </w:style>
-  <w:style w:type="paragraph" w:styleId="Naslov6">
+  <w:style w:type="paragraph" w:styleId="Heading6">
     <w:name w:val="heading 6"/>
-    <w:basedOn w:val="Navaden"/>
-    <w:next w:val="Navaden"/>
-    <w:link w:val="Naslov6Znak"/>
+    <w:basedOn w:val="Normal"/>
+    <w:next w:val="Normal"/>
+    <w:link w:val="Heading6Char"/>
     <w:uiPriority w:val="9"/>
     <w:semiHidden/>
     <w:unhideWhenUsed/>
@@ -3315,11 +4422,11 @@
       <w:color w:val="595959" w:themeColor="text1" w:themeTint="A6"/>
     </w:rPr>
   </w:style>
-  <w:style w:type="paragraph" w:styleId="Naslov7">
+  <w:style w:type="paragraph" w:styleId="Heading7">
     <w:name w:val="heading 7"/>
-    <w:basedOn w:val="Navaden"/>
-    <w:next w:val="Navaden"/>
-    <w:link w:val="Naslov7Znak"/>
+    <w:basedOn w:val="Normal"/>
+    <w:next w:val="Normal"/>
+    <w:link w:val="Heading7Char"/>
     <w:uiPriority w:val="9"/>
     <w:semiHidden/>
     <w:unhideWhenUsed/>
@@ -3340,11 +4447,11 @@
       <w:color w:val="595959" w:themeColor="text1" w:themeTint="A6"/>
     </w:rPr>
   </w:style>
-  <w:style w:type="paragraph" w:styleId="Naslov8">
+  <w:style w:type="paragraph" w:styleId="Heading8">
     <w:name w:val="heading 8"/>
-    <w:basedOn w:val="Navaden"/>
-    <w:next w:val="Navaden"/>
-    <w:link w:val="Naslov8Znak"/>
+    <w:basedOn w:val="Normal"/>
+    <w:next w:val="Normal"/>
+    <w:link w:val="Heading8Char"/>
     <w:uiPriority w:val="9"/>
     <w:semiHidden/>
     <w:unhideWhenUsed/>
@@ -3367,11 +4474,11 @@
       <w:color w:val="272727" w:themeColor="text1" w:themeTint="D8"/>
     </w:rPr>
   </w:style>
-  <w:style w:type="paragraph" w:styleId="Naslov9">
+  <w:style w:type="paragraph" w:styleId="Heading9">
     <w:name w:val="heading 9"/>
-    <w:basedOn w:val="Navaden"/>
-    <w:next w:val="Navaden"/>
-    <w:link w:val="Naslov9Znak"/>
+    <w:basedOn w:val="Normal"/>
+    <w:next w:val="Normal"/>
+    <w:link w:val="Heading9Char"/>
     <w:uiPriority w:val="9"/>
     <w:semiHidden/>
     <w:unhideWhenUsed/>
@@ -3392,13 +4499,13 @@
       <w:color w:val="272727" w:themeColor="text1" w:themeTint="D8"/>
     </w:rPr>
   </w:style>
-  <w:style w:type="character" w:default="1" w:styleId="Privzetapisavaodstavka">
+  <w:style w:type="character" w:default="1" w:styleId="DefaultParagraphFont">
     <w:name w:val="Default Paragraph Font"/>
     <w:uiPriority w:val="1"/>
     <w:semiHidden/>
     <w:unhideWhenUsed/>
   </w:style>
-  <w:style w:type="table" w:default="1" w:styleId="Navadnatabela">
+  <w:style w:type="table" w:default="1" w:styleId="TableNormal">
     <w:name w:val="Normal Table"/>
     <w:uiPriority w:val="99"/>
     <w:semiHidden/>
@@ -3413,16 +4520,16 @@
       </w:tblCellMar>
     </w:tblPr>
   </w:style>
-  <w:style w:type="numbering" w:default="1" w:styleId="Brezseznama">
+  <w:style w:type="numbering" w:default="1" w:styleId="NoList">
     <w:name w:val="No List"/>
     <w:uiPriority w:val="99"/>
     <w:semiHidden/>
     <w:unhideWhenUsed/>
   </w:style>
-  <w:style w:type="character" w:customStyle="1" w:styleId="Naslov1Znak">
-    <w:name w:val="Naslov 1 Znak"/>
-    <w:basedOn w:val="Privzetapisavaodstavka"/>
-    <w:link w:val="Naslov1"/>
+  <w:style w:type="character" w:customStyle="1" w:styleId="Heading1Char">
+    <w:name w:val="Heading 1 Char"/>
+    <w:basedOn w:val="DefaultParagraphFont"/>
+    <w:link w:val="Heading1"/>
     <w:uiPriority w:val="9"/>
     <w:rsid w:val="004A597C"/>
     <w:rPr>
@@ -3432,10 +4539,10 @@
       <w:szCs w:val="40"/>
     </w:rPr>
   </w:style>
-  <w:style w:type="character" w:customStyle="1" w:styleId="Naslov2Znak">
-    <w:name w:val="Naslov 2 Znak"/>
-    <w:basedOn w:val="Privzetapisavaodstavka"/>
-    <w:link w:val="Naslov2"/>
+  <w:style w:type="character" w:customStyle="1" w:styleId="Heading2Char">
+    <w:name w:val="Heading 2 Char"/>
+    <w:basedOn w:val="DefaultParagraphFont"/>
+    <w:link w:val="Heading2"/>
     <w:uiPriority w:val="9"/>
     <w:rsid w:val="004A597C"/>
     <w:rPr>
@@ -3445,10 +4552,10 @@
       <w:szCs w:val="32"/>
     </w:rPr>
   </w:style>
-  <w:style w:type="character" w:customStyle="1" w:styleId="Naslov3Znak">
-    <w:name w:val="Naslov 3 Znak"/>
-    <w:basedOn w:val="Privzetapisavaodstavka"/>
-    <w:link w:val="Naslov3"/>
+  <w:style w:type="character" w:customStyle="1" w:styleId="Heading3Char">
+    <w:name w:val="Heading 3 Char"/>
+    <w:basedOn w:val="DefaultParagraphFont"/>
+    <w:link w:val="Heading3"/>
     <w:uiPriority w:val="9"/>
     <w:rsid w:val="004A597C"/>
     <w:rPr>
@@ -3458,10 +4565,10 @@
       <w:szCs w:val="28"/>
     </w:rPr>
   </w:style>
-  <w:style w:type="character" w:customStyle="1" w:styleId="Naslov4Znak">
-    <w:name w:val="Naslov 4 Znak"/>
-    <w:basedOn w:val="Privzetapisavaodstavka"/>
-    <w:link w:val="Naslov4"/>
+  <w:style w:type="character" w:customStyle="1" w:styleId="Heading4Char">
+    <w:name w:val="Heading 4 Char"/>
+    <w:basedOn w:val="DefaultParagraphFont"/>
+    <w:link w:val="Heading4"/>
     <w:uiPriority w:val="9"/>
     <w:semiHidden/>
     <w:rsid w:val="004A597C"/>
@@ -3472,10 +4579,10 @@
       <w:color w:val="2F5496" w:themeColor="accent1" w:themeShade="BF"/>
     </w:rPr>
   </w:style>
-  <w:style w:type="character" w:customStyle="1" w:styleId="Naslov5Znak">
-    <w:name w:val="Naslov 5 Znak"/>
-    <w:basedOn w:val="Privzetapisavaodstavka"/>
-    <w:link w:val="Naslov5"/>
+  <w:style w:type="character" w:customStyle="1" w:styleId="Heading5Char">
+    <w:name w:val="Heading 5 Char"/>
+    <w:basedOn w:val="DefaultParagraphFont"/>
+    <w:link w:val="Heading5"/>
     <w:uiPriority w:val="9"/>
     <w:semiHidden/>
     <w:rsid w:val="004A597C"/>
@@ -3484,10 +4591,10 @@
       <w:color w:val="2F5496" w:themeColor="accent1" w:themeShade="BF"/>
     </w:rPr>
   </w:style>
-  <w:style w:type="character" w:customStyle="1" w:styleId="Naslov6Znak">
-    <w:name w:val="Naslov 6 Znak"/>
-    <w:basedOn w:val="Privzetapisavaodstavka"/>
-    <w:link w:val="Naslov6"/>
+  <w:style w:type="character" w:customStyle="1" w:styleId="Heading6Char">
+    <w:name w:val="Heading 6 Char"/>
+    <w:basedOn w:val="DefaultParagraphFont"/>
+    <w:link w:val="Heading6"/>
     <w:uiPriority w:val="9"/>
     <w:semiHidden/>
     <w:rsid w:val="004A597C"/>
@@ -3498,10 +4605,10 @@
       <w:color w:val="595959" w:themeColor="text1" w:themeTint="A6"/>
     </w:rPr>
   </w:style>
-  <w:style w:type="character" w:customStyle="1" w:styleId="Naslov7Znak">
-    <w:name w:val="Naslov 7 Znak"/>
-    <w:basedOn w:val="Privzetapisavaodstavka"/>
-    <w:link w:val="Naslov7"/>
+  <w:style w:type="character" w:customStyle="1" w:styleId="Heading7Char">
+    <w:name w:val="Heading 7 Char"/>
+    <w:basedOn w:val="DefaultParagraphFont"/>
+    <w:link w:val="Heading7"/>
     <w:uiPriority w:val="9"/>
     <w:semiHidden/>
     <w:rsid w:val="004A597C"/>
@@ -3510,10 +4617,10 @@
       <w:color w:val="595959" w:themeColor="text1" w:themeTint="A6"/>
     </w:rPr>
   </w:style>
-  <w:style w:type="character" w:customStyle="1" w:styleId="Naslov8Znak">
-    <w:name w:val="Naslov 8 Znak"/>
-    <w:basedOn w:val="Privzetapisavaodstavka"/>
-    <w:link w:val="Naslov8"/>
+  <w:style w:type="character" w:customStyle="1" w:styleId="Heading8Char">
+    <w:name w:val="Heading 8 Char"/>
+    <w:basedOn w:val="DefaultParagraphFont"/>
+    <w:link w:val="Heading8"/>
     <w:uiPriority w:val="9"/>
     <w:semiHidden/>
     <w:rsid w:val="004A597C"/>
@@ -3524,10 +4631,10 @@
       <w:color w:val="272727" w:themeColor="text1" w:themeTint="D8"/>
     </w:rPr>
   </w:style>
-  <w:style w:type="character" w:customStyle="1" w:styleId="Naslov9Znak">
-    <w:name w:val="Naslov 9 Znak"/>
-    <w:basedOn w:val="Privzetapisavaodstavka"/>
-    <w:link w:val="Naslov9"/>
+  <w:style w:type="character" w:customStyle="1" w:styleId="Heading9Char">
+    <w:name w:val="Heading 9 Char"/>
+    <w:basedOn w:val="DefaultParagraphFont"/>
+    <w:link w:val="Heading9"/>
     <w:uiPriority w:val="9"/>
     <w:semiHidden/>
     <w:rsid w:val="004A597C"/>
@@ -3536,11 +4643,11 @@
       <w:color w:val="272727" w:themeColor="text1" w:themeTint="D8"/>
     </w:rPr>
   </w:style>
-  <w:style w:type="paragraph" w:styleId="Naslov">
+  <w:style w:type="paragraph" w:styleId="Title">
     <w:name w:val="Title"/>
-    <w:basedOn w:val="Navaden"/>
-    <w:next w:val="Navaden"/>
-    <w:link w:val="NaslovZnak"/>
+    <w:basedOn w:val="Normal"/>
+    <w:next w:val="Normal"/>
+    <w:link w:val="TitleChar"/>
     <w:uiPriority w:val="10"/>
     <w:qFormat/>
     <w:rsid w:val="004A597C"/>
@@ -3556,10 +4663,10 @@
       <w:szCs w:val="56"/>
     </w:rPr>
   </w:style>
-  <w:style w:type="character" w:customStyle="1" w:styleId="NaslovZnak">
-    <w:name w:val="Naslov Znak"/>
-    <w:basedOn w:val="Privzetapisavaodstavka"/>
-    <w:link w:val="Naslov"/>
+  <w:style w:type="character" w:customStyle="1" w:styleId="TitleChar">
+    <w:name w:val="Title Char"/>
+    <w:basedOn w:val="DefaultParagraphFont"/>
+    <w:link w:val="Title"/>
     <w:uiPriority w:val="10"/>
     <w:rsid w:val="004A597C"/>
     <w:rPr>
@@ -3570,11 +4677,11 @@
       <w:szCs w:val="56"/>
     </w:rPr>
   </w:style>
-  <w:style w:type="paragraph" w:styleId="Podnaslov">
+  <w:style w:type="paragraph" w:styleId="Subtitle">
     <w:name w:val="Subtitle"/>
-    <w:basedOn w:val="Navaden"/>
-    <w:next w:val="Navaden"/>
-    <w:link w:val="PodnaslovZnak"/>
+    <w:basedOn w:val="Normal"/>
+    <w:next w:val="Normal"/>
+    <w:link w:val="SubtitleChar"/>
     <w:uiPriority w:val="11"/>
     <w:qFormat/>
     <w:rsid w:val="004A597C"/>
@@ -3591,10 +4698,10 @@
       <w:szCs w:val="28"/>
     </w:rPr>
   </w:style>
-  <w:style w:type="character" w:customStyle="1" w:styleId="PodnaslovZnak">
-    <w:name w:val="Podnaslov Znak"/>
-    <w:basedOn w:val="Privzetapisavaodstavka"/>
-    <w:link w:val="Podnaslov"/>
+  <w:style w:type="character" w:customStyle="1" w:styleId="SubtitleChar">
+    <w:name w:val="Subtitle Char"/>
+    <w:basedOn w:val="DefaultParagraphFont"/>
+    <w:link w:val="Subtitle"/>
     <w:uiPriority w:val="11"/>
     <w:rsid w:val="004A597C"/>
     <w:rPr>
@@ -3605,11 +4712,11 @@
       <w:szCs w:val="28"/>
     </w:rPr>
   </w:style>
-  <w:style w:type="paragraph" w:styleId="Citat">
+  <w:style w:type="paragraph" w:styleId="Quote">
     <w:name w:val="Quote"/>
-    <w:basedOn w:val="Navaden"/>
-    <w:next w:val="Navaden"/>
-    <w:link w:val="CitatZnak"/>
+    <w:basedOn w:val="Normal"/>
+    <w:next w:val="Normal"/>
+    <w:link w:val="QuoteChar"/>
     <w:uiPriority w:val="29"/>
     <w:qFormat/>
     <w:rsid w:val="004A597C"/>
@@ -3623,10 +4730,10 @@
       <w:color w:val="404040" w:themeColor="text1" w:themeTint="BF"/>
     </w:rPr>
   </w:style>
-  <w:style w:type="character" w:customStyle="1" w:styleId="CitatZnak">
-    <w:name w:val="Citat Znak"/>
-    <w:basedOn w:val="Privzetapisavaodstavka"/>
-    <w:link w:val="Citat"/>
+  <w:style w:type="character" w:customStyle="1" w:styleId="QuoteChar">
+    <w:name w:val="Quote Char"/>
+    <w:basedOn w:val="DefaultParagraphFont"/>
+    <w:link w:val="Quote"/>
     <w:uiPriority w:val="29"/>
     <w:rsid w:val="004A597C"/>
     <w:rPr>
@@ -3635,9 +4742,9 @@
       <w:color w:val="404040" w:themeColor="text1" w:themeTint="BF"/>
     </w:rPr>
   </w:style>
-  <w:style w:type="paragraph" w:styleId="Odstavekseznama">
+  <w:style w:type="paragraph" w:styleId="ListParagraph">
     <w:name w:val="List Paragraph"/>
-    <w:basedOn w:val="Navaden"/>
+    <w:basedOn w:val="Normal"/>
     <w:uiPriority w:val="34"/>
     <w:qFormat/>
     <w:rsid w:val="004A597C"/>
@@ -3646,9 +4753,9 @@
       <w:contextualSpacing/>
     </w:pPr>
   </w:style>
-  <w:style w:type="character" w:styleId="Intenzivenpoudarek">
+  <w:style w:type="character" w:styleId="IntenseEmphasis">
     <w:name w:val="Intense Emphasis"/>
-    <w:basedOn w:val="Privzetapisavaodstavka"/>
+    <w:basedOn w:val="DefaultParagraphFont"/>
     <w:uiPriority w:val="21"/>
     <w:qFormat/>
     <w:rsid w:val="004A597C"/>
@@ -3658,11 +4765,11 @@
       <w:color w:val="2F5496" w:themeColor="accent1" w:themeShade="BF"/>
     </w:rPr>
   </w:style>
-  <w:style w:type="paragraph" w:styleId="Intenzivencitat">
+  <w:style w:type="paragraph" w:styleId="IntenseQuote">
     <w:name w:val="Intense Quote"/>
-    <w:basedOn w:val="Navaden"/>
-    <w:next w:val="Navaden"/>
-    <w:link w:val="IntenzivencitatZnak"/>
+    <w:basedOn w:val="Normal"/>
+    <w:next w:val="Normal"/>
+    <w:link w:val="IntenseQuoteChar"/>
     <w:uiPriority w:val="30"/>
     <w:qFormat/>
     <w:rsid w:val="004A597C"/>
@@ -3681,10 +4788,10 @@
       <w:color w:val="2F5496" w:themeColor="accent1" w:themeShade="BF"/>
     </w:rPr>
   </w:style>
-  <w:style w:type="character" w:customStyle="1" w:styleId="IntenzivencitatZnak">
-    <w:name w:val="Intenziven citat Znak"/>
-    <w:basedOn w:val="Privzetapisavaodstavka"/>
-    <w:link w:val="Intenzivencitat"/>
+  <w:style w:type="character" w:customStyle="1" w:styleId="IntenseQuoteChar">
+    <w:name w:val="Intense Quote Char"/>
+    <w:basedOn w:val="DefaultParagraphFont"/>
+    <w:link w:val="IntenseQuote"/>
     <w:uiPriority w:val="30"/>
     <w:rsid w:val="004A597C"/>
     <w:rPr>
@@ -3693,9 +4800,9 @@
       <w:color w:val="2F5496" w:themeColor="accent1" w:themeShade="BF"/>
     </w:rPr>
   </w:style>
-  <w:style w:type="character" w:styleId="Intenzivensklic">
+  <w:style w:type="character" w:styleId="IntenseReference">
     <w:name w:val="Intense Reference"/>
-    <w:basedOn w:val="Privzetapisavaodstavka"/>
+    <w:basedOn w:val="DefaultParagraphFont"/>
     <w:uiPriority w:val="32"/>
     <w:qFormat/>
     <w:rsid w:val="004A597C"/>
@@ -3707,10 +4814,10 @@
       <w:spacing w:val="5"/>
     </w:rPr>
   </w:style>
-  <w:style w:type="paragraph" w:styleId="Kazalovsebine1">
+  <w:style w:type="paragraph" w:styleId="TOC1">
     <w:name w:val="toc 1"/>
-    <w:basedOn w:val="Navaden"/>
-    <w:next w:val="Navaden"/>
+    <w:basedOn w:val="Normal"/>
+    <w:next w:val="Normal"/>
     <w:autoRedefine/>
     <w:uiPriority w:val="39"/>
     <w:unhideWhenUsed/>
@@ -3728,10 +4835,10 @@
       <w:lang w:val="sl-SI"/>
     </w:rPr>
   </w:style>
-  <w:style w:type="paragraph" w:styleId="Kazalovsebine2">
+  <w:style w:type="paragraph" w:styleId="TOC2">
     <w:name w:val="toc 2"/>
-    <w:basedOn w:val="Navaden"/>
-    <w:next w:val="Navaden"/>
+    <w:basedOn w:val="Normal"/>
+    <w:next w:val="Normal"/>
     <w:autoRedefine/>
     <w:uiPriority w:val="39"/>
     <w:unhideWhenUsed/>
@@ -3741,10 +4848,10 @@
       <w:ind w:left="240"/>
     </w:pPr>
   </w:style>
-  <w:style w:type="paragraph" w:styleId="Kazalovsebine3">
+  <w:style w:type="paragraph" w:styleId="TOC3">
     <w:name w:val="toc 3"/>
-    <w:basedOn w:val="Navaden"/>
-    <w:next w:val="Navaden"/>
+    <w:basedOn w:val="Normal"/>
+    <w:next w:val="Normal"/>
     <w:autoRedefine/>
     <w:uiPriority w:val="39"/>
     <w:unhideWhenUsed/>
@@ -3754,9 +4861,9 @@
       <w:ind w:left="480"/>
     </w:pPr>
   </w:style>
-  <w:style w:type="character" w:styleId="Hiperpovezava">
+  <w:style w:type="character" w:styleId="Hyperlink">
     <w:name w:val="Hyperlink"/>
-    <w:basedOn w:val="Privzetapisavaodstavka"/>
+    <w:basedOn w:val="DefaultParagraphFont"/>
     <w:uiPriority w:val="99"/>
     <w:unhideWhenUsed/>
     <w:rsid w:val="001863EF"/>

</xml_diff>